<commit_message>
EOD 2026-04-20 (Monday PT) — 14 completions (5 genuine, 9 bulk-cleanup), 6 Today→Urgent demotions, L1 streak 22 workdays zero, Vijeth/Andes delegations FAILED
</commit_message>
<xml_diff>
--- a/wiki/state-files/au-paid-search-state.docx
+++ b/wiki/state-files/au-paid-search-state.docx
@@ -25,12 +25,12 @@
     </w:p>
     <w:p>
       <w:r>
-        <w:t>**Reporting period:** Week 14 (Mar 29–Apr 4, 2026) · **Market owner:** Richard Williams · **Primary stakeholder:** Lena Zak (L7) · **Execution partner:** Alexis Eck (L6)</w:t>
+        <w:t>**Reporting period:** Week 15 (Apr 6–12, 2026) · **Market owner:** Richard Williams · **Primary stakeholder:** Lena Zak (L7) · **Execution partner:** Alexis Eck (L6)</w:t>
       </w:r>
     </w:p>
     <w:p>
       <w:r>
-        <w:t>**Data through:** AU W14 actuals; MX W13 actuals; WW W14 actuals.</w:t>
+        <w:t>**Data through:** AU W15 actuals; MX W15 actuals; WW W15 actuals.</w:t>
       </w:r>
     </w:p>
     <w:p>
@@ -154,7 +154,12 @@
     </w:p>
     <w:p>
       <w:r>
-        <w:t>AU drove 170 registrations in W14 (-18.3% WoW) on $22K spend (-9.5% WoW), producing a blended CPA of $130 (+10.8% WoW). This extends the registration decline streak to 6 consecutive weeks: 328 in W7 to 207 in W13 to 170 in W14, a cumulative -48% decline from the W7 peak. NB registrations fell to 47% below the trailing average, and NB CVR dropped to 37% below the trailing average. The Polaris URL migration completed mid-week in W13 correlates exactly with the mid-W13 CVR collapse (Mon-Tue 53/50 regs → Wed-Sat 27/22/23/8).</w:t>
+        <w:t>AU drove 168 registrations in W15 (-1.2% WoW, -29% vs trailing 8-week average of 236) on $25,829 spend (+17.0% WoW) at a blended CPA of $153.74 (+18.4% WoW). W15 extends the registration decline streak to 7 consecutive weeks and is the lowest weekly output in the trailing 8 weeks. Spend rose while registrations fell, driving a 3-week consecutive CPA increase: $114.77 (W12) → $117.22 (W13) → $129.84 (W14) → $153.74 (W15). The Polaris URL migration tracking issue remains unresolved and is the leading candidate root cause for the sustained CVR compression.</w:t>
+      </w:r>
+    </w:p>
+    <w:p>
+      <w:r>
+        <w:t>On April 17, Alex VanDerStuyf (MCS) confirmed that Italy's Polaris `/cp/ps-brand` page (launched April 1) routed Italian signup traffic to the AU domain via an incorrect ref tag — a P0 production bug that was detected on April 16 during the Polaris LP sync. Legacy Italy template was restored April 16; the Polaris Italy variant is now parked in AEM as `it/cp/ps-brand-new`. This is an Italy-to-AU routing issue, not an AU page issue, but it is an additional indicator that the Polaris template rollout has introduced ref tag regressions that require systematic verification before AU's tracking can be treated as clean.</w:t>
       </w:r>
     </w:p>
     <w:p>
@@ -191,7 +196,7 @@
           </w:tcPr>
           <w:p>
             <w:r>
-              <w:t>W14 Value</w:t>
+              <w:t>W15 Value</w:t>
             </w:r>
           </w:p>
         </w:tc>
@@ -233,7 +238,7 @@
           </w:tcPr>
           <w:p>
             <w:r>
-              <w:t>$22,000</w:t>
+              <w:t>$25,829</w:t>
             </w:r>
           </w:p>
         </w:tc>
@@ -243,7 +248,7 @@
           </w:tcPr>
           <w:p>
             <w:r>
-              <w:t>-9.5%</w:t>
+              <w:t>+17.0%</w:t>
             </w:r>
           </w:p>
         </w:tc>
@@ -253,7 +258,7 @@
           </w:tcPr>
           <w:p>
             <w:r>
-              <w:t>Second consecutive weekly decline</w:t>
+              <w:t>Reversed W14 decline; highest since W11</w:t>
             </w:r>
           </w:p>
         </w:tc>
@@ -265,7 +270,7 @@
           </w:tcPr>
           <w:p>
             <w:r>
-              <w:t>Brand clicks</w:t>
+              <w:t>Brand CVR</w:t>
             </w:r>
           </w:p>
         </w:tc>
@@ -275,7 +280,7 @@
           </w:tcPr>
           <w:p>
             <w:r>
-              <w:t>—</w:t>
+              <w:t>6.08%</w:t>
             </w:r>
           </w:p>
         </w:tc>
@@ -285,7 +290,7 @@
           </w:tcPr>
           <w:p>
             <w:r>
-              <w:t>—</w:t>
+              <w:t>-10.6%</w:t>
             </w:r>
           </w:p>
         </w:tc>
@@ -295,7 +300,7 @@
           </w:tcPr>
           <w:p>
             <w:r>
-              <w:t>CVR decline driving reg drop, not click volume</w:t>
+              <w:t>Below 8-week avg of 7.46%</w:t>
             </w:r>
           </w:p>
         </w:tc>
@@ -307,7 +312,7 @@
           </w:tcPr>
           <w:p>
             <w:r>
-              <w:t>NB clicks</w:t>
+              <w:t>NB CVR</w:t>
             </w:r>
           </w:p>
         </w:tc>
@@ -317,7 +322,7 @@
           </w:tcPr>
           <w:p>
             <w:r>
-              <w:t>—</w:t>
+              <w:t>1.99%</w:t>
             </w:r>
           </w:p>
         </w:tc>
@@ -327,7 +332,7 @@
           </w:tcPr>
           <w:p>
             <w:r>
-              <w:t>—</w:t>
+              <w:t>+6.4%</w:t>
             </w:r>
           </w:p>
         </w:tc>
@@ -337,7 +342,7 @@
           </w:tcPr>
           <w:p>
             <w:r>
-              <w:t>Click volume stable; conversion efficiency degraded</w:t>
+              <w:t>27% below 8-week average of 2.74%</w:t>
             </w:r>
           </w:p>
         </w:tc>
@@ -359,7 +364,7 @@
           </w:tcPr>
           <w:p>
             <w:r>
-              <w:t>$4.81 (W13)</w:t>
+              <w:t>$4.77</w:t>
             </w:r>
           </w:p>
         </w:tc>
@@ -369,7 +374,7 @@
           </w:tcPr>
           <w:p>
             <w:r>
-              <w:t>-29% from W6 peak</w:t>
+              <w:t>-0.8%</w:t>
             </w:r>
           </w:p>
         </w:tc>
@@ -379,7 +384,7 @@
           </w:tcPr>
           <w:p>
             <w:r>
-              <w:t>7-week decline streak</w:t>
+              <w:t>15% below 8-week average of $5.61</w:t>
             </w:r>
           </w:p>
         </w:tc>
@@ -391,7 +396,7 @@
           </w:tcPr>
           <w:p>
             <w:r>
-              <w:t>Polaris migration</w:t>
+              <w:t>Max-clicks bid strategy</w:t>
             </w:r>
           </w:p>
         </w:tc>
@@ -401,7 +406,7 @@
           </w:tcPr>
           <w:p>
             <w:r>
-              <w:t>Completed mid-W13</w:t>
+              <w:t>Live 4/17</w:t>
             </w:r>
           </w:p>
         </w:tc>
@@ -421,7 +426,7 @@
           </w:tcPr>
           <w:p>
             <w:r>
-              <w:t>CVR collapse correlates with migration timing</w:t>
+              <w:t>Carried forward from Friday handover; Monday check pending</w:t>
             </w:r>
           </w:p>
         </w:tc>
@@ -461,7 +466,7 @@
           </w:tcPr>
           <w:p>
             <w:r>
-              <w:t>W14 Value</w:t>
+              <w:t>W15 Value</w:t>
             </w:r>
           </w:p>
         </w:tc>
@@ -503,7 +508,7 @@
           </w:tcPr>
           <w:p>
             <w:r>
-              <w:t>170</w:t>
+              <w:t>168</w:t>
             </w:r>
           </w:p>
         </w:tc>
@@ -513,7 +518,7 @@
           </w:tcPr>
           <w:p>
             <w:r>
-              <w:t>-18.3%</w:t>
+              <w:t>-1.2%</w:t>
             </w:r>
           </w:p>
         </w:tc>
@@ -523,7 +528,7 @@
           </w:tcPr>
           <w:p>
             <w:r>
-              <w:t>Below 248/wk needed for 12,906 FY26</w:t>
+              <w:t>32% below 248/wk needed for 12,906 FY26</w:t>
             </w:r>
           </w:p>
         </w:tc>
@@ -545,7 +550,7 @@
           </w:tcPr>
           <w:p>
             <w:r>
-              <w:t>~73 (est.)</w:t>
+              <w:t>77</w:t>
             </w:r>
           </w:p>
         </w:tc>
@@ -555,7 +560,7 @@
           </w:tcPr>
           <w:p>
             <w:r>
-              <w:t>-18%</w:t>
+              <w:t>-19.8%</w:t>
             </w:r>
           </w:p>
         </w:tc>
@@ -565,7 +570,7 @@
           </w:tcPr>
           <w:p>
             <w:r>
-              <w:t>CVR 7.37% (-14% WoW in W13)</w:t>
+              <w:t>Lowest in trailing 8 weeks</w:t>
             </w:r>
           </w:p>
         </w:tc>
@@ -587,7 +592,7 @@
           </w:tcPr>
           <w:p>
             <w:r>
-              <w:t>~97 (est.)</w:t>
+              <w:t>91</w:t>
             </w:r>
           </w:p>
         </w:tc>
@@ -597,7 +602,7 @@
           </w:tcPr>
           <w:p>
             <w:r>
-              <w:t>-13%</w:t>
+              <w:t>+23.0%</w:t>
             </w:r>
           </w:p>
         </w:tc>
@@ -607,7 +612,7 @@
           </w:tcPr>
           <w:p>
             <w:r>
-              <w:t>47% below trailing avg</w:t>
+              <w:t>Recovered from W14 low of 74</w:t>
             </w:r>
           </w:p>
         </w:tc>
@@ -629,7 +634,7 @@
           </w:tcPr>
           <w:p>
             <w:r>
-              <w:t>$130</w:t>
+              <w:t>$153.74</w:t>
             </w:r>
           </w:p>
         </w:tc>
@@ -639,7 +644,7 @@
           </w:tcPr>
           <w:p>
             <w:r>
-              <w:t>+10.8%</w:t>
+              <w:t>+18.4%</w:t>
             </w:r>
           </w:p>
         </w:tc>
@@ -649,7 +654,7 @@
           </w:tcPr>
           <w:p>
             <w:r>
-              <w:t>Below $140 target (favorable)</w:t>
+              <w:t>$13.74 above $140 OP2 target</w:t>
             </w:r>
           </w:p>
         </w:tc>
@@ -671,7 +676,7 @@
           </w:tcPr>
           <w:p>
             <w:r>
-              <w:t>~$41 (W13)</w:t>
+              <w:t>$52.59</w:t>
             </w:r>
           </w:p>
         </w:tc>
@@ -681,7 +686,7 @@
           </w:tcPr>
           <w:p>
             <w:r>
-              <w:t>+10% WoW</w:t>
+              <w:t>+17.5%</w:t>
             </w:r>
           </w:p>
         </w:tc>
@@ -691,7 +696,7 @@
           </w:tcPr>
           <w:p>
             <w:r>
-              <w:t>Stable</w:t>
+              <w:t>Above $35–$45 stability band</w:t>
             </w:r>
           </w:p>
         </w:tc>
@@ -713,7 +718,7 @@
           </w:tcPr>
           <w:p>
             <w:r>
-              <w:t>~$187 (W13)</w:t>
+              <w:t>$239.34</w:t>
             </w:r>
           </w:p>
         </w:tc>
@@ -723,7 +728,7 @@
           </w:tcPr>
           <w:p>
             <w:r>
-              <w:t>Flat</w:t>
+              <w:t>-0.4%</w:t>
             </w:r>
           </w:p>
         </w:tc>
@@ -733,7 +738,7 @@
           </w:tcPr>
           <w:p>
             <w:r>
-              <w:t>Above target; CPC decline not yet flowing to CPA</w:t>
+              <w:t>Roughly flat vs W14</w:t>
             </w:r>
           </w:p>
         </w:tc>
@@ -745,7 +750,7 @@
           </w:tcPr>
           <w:p>
             <w:r>
-              <w:t>NB CVR</w:t>
+              <w:t>Brand spend</w:t>
             </w:r>
           </w:p>
         </w:tc>
@@ -755,7 +760,7 @@
           </w:tcPr>
           <w:p>
             <w:r>
-              <w:t>2.58% (W13)</w:t>
+              <w:t>$4,049</w:t>
             </w:r>
           </w:p>
         </w:tc>
@@ -765,7 +770,7 @@
           </w:tcPr>
           <w:p>
             <w:r>
-              <w:t>-10% WoW</w:t>
+              <w:t>-5.7%</w:t>
             </w:r>
           </w:p>
         </w:tc>
@@ -775,7 +780,49 @@
           </w:tcPr>
           <w:p>
             <w:r>
-              <w:t>37% below trailing avg</w:t>
+              <w:t>Continuing spend discipline</w:t>
+            </w:r>
+          </w:p>
+        </w:tc>
+      </w:tr>
+      <w:tr>
+        <w:tc>
+          <w:tcPr>
+            <w:tcW w:type="dxa" w:w="2160"/>
+          </w:tcPr>
+          <w:p>
+            <w:r>
+              <w:t>NB spend</w:t>
+            </w:r>
+          </w:p>
+        </w:tc>
+        <w:tc>
+          <w:tcPr>
+            <w:tcW w:type="dxa" w:w="2160"/>
+          </w:tcPr>
+          <w:p>
+            <w:r>
+              <w:t>$21,780</w:t>
+            </w:r>
+          </w:p>
+        </w:tc>
+        <w:tc>
+          <w:tcPr>
+            <w:tcW w:type="dxa" w:w="2160"/>
+          </w:tcPr>
+          <w:p>
+            <w:r>
+              <w:t>+22.5%</w:t>
+            </w:r>
+          </w:p>
+        </w:tc>
+        <w:tc>
+          <w:tcPr>
+            <w:tcW w:type="dxa" w:w="2160"/>
+          </w:tcPr>
+          <w:p>
+            <w:r>
+              <w:t>NB absorbed the spend increase</w:t>
             </w:r>
           </w:p>
         </w:tc>
@@ -783,12 +830,37 @@
     </w:tbl>
     <w:p>
       <w:r>
-        <w:t>W13 detail: 207 registrations (-16% WoW), $24K spend (-13% WoW), CPA $118 (+3% WoW). Brand delivered 98 registrations (-18%) at 7.37% CVR (-14%) and $41 CPA (+10%). NB delivered 109 registrations (-13%) at 2.58% CVR (-10%) and $187 CPA (flat), with CPC at $4.81 continuing a 7-week decline streak (-29% from the W6 peak). The CPC decline is a positive efficiency signal, but it has not yet translated to CPA improvement because CVR degradation is offsetting the CPC gains.</w:t>
+        <w:t>The W15 pattern differs from W14: Brand and NB moved in opposite directions. Brand registrations dropped -19.8% on -5.7% spend — a CVR problem (6.08% vs 7.15% W14). NB registrations rose +23.0% on +22.5% spend — volume recovery on nearly flat CPA. The NB CPC decline streak held at $4.77, confirming Brandon's surgical-not-broad keyword approach continues to suppress cost per click without eroding CPA because CVR also softened.</w:t>
       </w:r>
     </w:p>
     <w:p>
       <w:r>
-        <w:t>March is projected to close at approximately 1,030 registrations, $125K spend, and $121 CPA — versus OP2 targets of 1,082 registrations, $148K spend, and $136 CPA. This represents -5% on registrations, -15% on spend, and -11% on CPA (favorable). The CPA outperformance is driven by spend discipline rather than conversion efficiency; the registration shortfall against OP2 is a volume concern that the 6-week decline streak amplifies.</w:t>
+        <w:t>**April MTD (through W15):** 168 registrations and $25,829 spend against OP2 month targets of 1,071 regs and $147,592 spend — 15.7% pacing on registrations and 17.5% pacing on cost at 19% of the month elapsed. Week 1 of April captured only one week of data; April pacing will be reassessed at W16.</w:t>
+      </w:r>
+    </w:p>
+    <w:p>
+      <w:r>
+        <w:t>&lt;!-- WBR-OWNED:prediction-scoring START --&gt;</w:t>
+      </w:r>
+    </w:p>
+    <w:p>
+      <w:r>
+        <w:t>&lt;!-- WBR-OWNED:prediction-scoring END --&gt;</w:t>
+      </w:r>
+    </w:p>
+    <w:p>
+      <w:r>
+        <w:t>&lt;!-- WBR-OWNED:forecast START --&gt;</w:t>
+      </w:r>
+    </w:p>
+    <w:p>
+      <w:r>
+        <w:t>**W16 forecast (Bayesian seasonal brand/NB split, forecast date 2026-04-15):** 207 registrations (CI 188–288), $26,396 spend, $115 CPA. The forecast assumes a post-Easter recovery pattern consistent with April 2025, with brand CVR recovering toward the 8-week average of 7.46%. If actual W16 registrations fall below the CI low of 188, the Polaris tracking hypothesis upgrades from candidate root cause to confirmed driver.</w:t>
+      </w:r>
+    </w:p>
+    <w:p>
+      <w:r>
+        <w:t>&lt;!-- WBR-OWNED:forecast END --&gt;</w:t>
       </w:r>
     </w:p>
     <w:p>
@@ -797,8 +869,320 @@
       </w:r>
     </w:p>
     <w:p>
+      <w:pPr>
+        <w:pStyle w:val="Heading2"/>
+      </w:pPr>
       <w:r>
-        <w:t>**Cost of inaction (null case):** If the Polaris URL migration tracking integrity is not validated within the next 7 days, the team cannot distinguish between a genuine CVR decline and a tracking artifact. The W13 daily pattern (strong Mon-Tue, collapsed Wed-Sat) aligns precisely with migration timing, but without validation, every subsequent week's data is suspect. At the current W14 run rate of 170 registrations per week, AU would deliver approximately 8,840 FY26 registrations — 31% below the 12,906 OP2 target and $570K below the $1.8M budget plan. Separately, OCI launch is targeted for May 2026 but no MCC has been created. MCC creation requires 2–3 weeks of lead time for Google Ads account setup and conversion signal configuration. If MCC creation does not begin by mid-April, the May launch slips to June or later, forgoing the 18–24% registration uplift observed in comparable OCI markets (US +24%, UK +23%, DE +18%). At AU's current 170 regs/week baseline, a 20% OCI uplift would add approximately 34 registrations per week — 1,768 annualized registrations worth approximately $230K at $130 CPA.</w:t>
+        <w:t>Flags</w:t>
+      </w:r>
+    </w:p>
+    <w:p>
+      <w:r>
+        <w:t>&lt;!-- AM-OWNED:trailing-week-flags START --&gt;</w:t>
+      </w:r>
+    </w:p>
+    <w:p>
+      <w:r>
+        <w:t>4 anomalies detected (&gt;20% deviation from 8-week average):</w:t>
+      </w:r>
+    </w:p>
+    <w:tbl>
+      <w:tblPr>
+        <w:tblStyle w:val="TableGrid"/>
+        <w:tblW w:type="auto" w:w="0"/>
+        <w:tblLook w:firstColumn="1" w:firstRow="1" w:lastColumn="0" w:lastRow="0" w:noHBand="0" w:noVBand="1" w:val="04A0"/>
+      </w:tblPr>
+      <w:tblGrid>
+        <w:gridCol w:w="1728"/>
+        <w:gridCol w:w="1728"/>
+        <w:gridCol w:w="1728"/>
+        <w:gridCol w:w="1728"/>
+        <w:gridCol w:w="1728"/>
+      </w:tblGrid>
+      <w:tr>
+        <w:tc>
+          <w:tcPr>
+            <w:tcW w:type="dxa" w:w="1728"/>
+          </w:tcPr>
+          <w:p>
+            <w:r>
+              <w:t>Metric</w:t>
+            </w:r>
+          </w:p>
+        </w:tc>
+        <w:tc>
+          <w:tcPr>
+            <w:tcW w:type="dxa" w:w="1728"/>
+          </w:tcPr>
+          <w:p>
+            <w:r>
+              <w:t>W15 Value</w:t>
+            </w:r>
+          </w:p>
+        </w:tc>
+        <w:tc>
+          <w:tcPr>
+            <w:tcW w:type="dxa" w:w="1728"/>
+          </w:tcPr>
+          <w:p>
+            <w:r>
+              <w:t>8-Week Avg</w:t>
+            </w:r>
+          </w:p>
+        </w:tc>
+        <w:tc>
+          <w:tcPr>
+            <w:tcW w:type="dxa" w:w="1728"/>
+          </w:tcPr>
+          <w:p>
+            <w:r>
+              <w:t>Deviation</w:t>
+            </w:r>
+          </w:p>
+        </w:tc>
+        <w:tc>
+          <w:tcPr>
+            <w:tcW w:type="dxa" w:w="1728"/>
+          </w:tcPr>
+          <w:p>
+            <w:r>
+              <w:t>Implication</w:t>
+            </w:r>
+          </w:p>
+        </w:tc>
+      </w:tr>
+      <w:tr>
+        <w:tc>
+          <w:tcPr>
+            <w:tcW w:type="dxa" w:w="1728"/>
+          </w:tcPr>
+          <w:p>
+            <w:r>
+              <w:t>Registrations</w:t>
+            </w:r>
+          </w:p>
+        </w:tc>
+        <w:tc>
+          <w:tcPr>
+            <w:tcW w:type="dxa" w:w="1728"/>
+          </w:tcPr>
+          <w:p>
+            <w:r>
+              <w:t>168</w:t>
+            </w:r>
+          </w:p>
+        </w:tc>
+        <w:tc>
+          <w:tcPr>
+            <w:tcW w:type="dxa" w:w="1728"/>
+          </w:tcPr>
+          <w:p>
+            <w:r>
+              <w:t>236</w:t>
+            </w:r>
+          </w:p>
+        </w:tc>
+        <w:tc>
+          <w:tcPr>
+            <w:tcW w:type="dxa" w:w="1728"/>
+          </w:tcPr>
+          <w:p>
+            <w:r>
+              <w:t>-29%</w:t>
+            </w:r>
+          </w:p>
+        </w:tc>
+        <w:tc>
+          <w:tcPr>
+            <w:tcW w:type="dxa" w:w="1728"/>
+          </w:tcPr>
+          <w:p>
+            <w:r>
+              <w:t>7-week decline streak confirmed</w:t>
+            </w:r>
+          </w:p>
+        </w:tc>
+      </w:tr>
+      <w:tr>
+        <w:tc>
+          <w:tcPr>
+            <w:tcW w:type="dxa" w:w="1728"/>
+          </w:tcPr>
+          <w:p>
+            <w:r>
+              <w:t>Brand registrations</w:t>
+            </w:r>
+          </w:p>
+        </w:tc>
+        <w:tc>
+          <w:tcPr>
+            <w:tcW w:type="dxa" w:w="1728"/>
+          </w:tcPr>
+          <w:p>
+            <w:r>
+              <w:t>77</w:t>
+            </w:r>
+          </w:p>
+        </w:tc>
+        <w:tc>
+          <w:tcPr>
+            <w:tcW w:type="dxa" w:w="1728"/>
+          </w:tcPr>
+          <w:p>
+            <w:r>
+              <w:t>104</w:t>
+            </w:r>
+          </w:p>
+        </w:tc>
+        <w:tc>
+          <w:tcPr>
+            <w:tcW w:type="dxa" w:w="1728"/>
+          </w:tcPr>
+          <w:p>
+            <w:r>
+              <w:t>-26%</w:t>
+            </w:r>
+          </w:p>
+        </w:tc>
+        <w:tc>
+          <w:tcPr>
+            <w:tcW w:type="dxa" w:w="1728"/>
+          </w:tcPr>
+          <w:p>
+            <w:r>
+              <w:t>Brand-side contribution weakening</w:t>
+            </w:r>
+          </w:p>
+        </w:tc>
+      </w:tr>
+      <w:tr>
+        <w:tc>
+          <w:tcPr>
+            <w:tcW w:type="dxa" w:w="1728"/>
+          </w:tcPr>
+          <w:p>
+            <w:r>
+              <w:t>NB CVR</w:t>
+            </w:r>
+          </w:p>
+        </w:tc>
+        <w:tc>
+          <w:tcPr>
+            <w:tcW w:type="dxa" w:w="1728"/>
+          </w:tcPr>
+          <w:p>
+            <w:r>
+              <w:t>1.99%</w:t>
+            </w:r>
+          </w:p>
+        </w:tc>
+        <w:tc>
+          <w:tcPr>
+            <w:tcW w:type="dxa" w:w="1728"/>
+          </w:tcPr>
+          <w:p>
+            <w:r>
+              <w:t>2.74%</w:t>
+            </w:r>
+          </w:p>
+        </w:tc>
+        <w:tc>
+          <w:tcPr>
+            <w:tcW w:type="dxa" w:w="1728"/>
+          </w:tcPr>
+          <w:p>
+            <w:r>
+              <w:t>-27%</w:t>
+            </w:r>
+          </w:p>
+        </w:tc>
+        <w:tc>
+          <w:tcPr>
+            <w:tcW w:type="dxa" w:w="1728"/>
+          </w:tcPr>
+          <w:p>
+            <w:r>
+              <w:t>5th consecutive week below baseline 2.5%–3.5%</w:t>
+            </w:r>
+          </w:p>
+        </w:tc>
+      </w:tr>
+      <w:tr>
+        <w:tc>
+          <w:tcPr>
+            <w:tcW w:type="dxa" w:w="1728"/>
+          </w:tcPr>
+          <w:p>
+            <w:r>
+              <w:t>Brand CPA</w:t>
+            </w:r>
+          </w:p>
+        </w:tc>
+        <w:tc>
+          <w:tcPr>
+            <w:tcW w:type="dxa" w:w="1728"/>
+          </w:tcPr>
+          <w:p>
+            <w:r>
+              <w:t>$52.59</w:t>
+            </w:r>
+          </w:p>
+        </w:tc>
+        <w:tc>
+          <w:tcPr>
+            <w:tcW w:type="dxa" w:w="1728"/>
+          </w:tcPr>
+          <w:p>
+            <w:r>
+              <w:t>$45.88</w:t>
+            </w:r>
+          </w:p>
+        </w:tc>
+        <w:tc>
+          <w:tcPr>
+            <w:tcW w:type="dxa" w:w="1728"/>
+          </w:tcPr>
+          <w:p>
+            <w:r>
+              <w:t>+15%</w:t>
+            </w:r>
+          </w:p>
+        </w:tc>
+        <w:tc>
+          <w:tcPr>
+            <w:tcW w:type="dxa" w:w="1728"/>
+          </w:tcPr>
+          <w:p>
+            <w:r>
+              <w:t>Above $35–$45 stability band</w:t>
+            </w:r>
+          </w:p>
+        </w:tc>
+      </w:tr>
+    </w:tbl>
+    <w:p>
+      <w:r>
+        <w:t>**Recommended action:** Do not treat the W15 regression as proof of structural decline without first validating Polaris tracking. Brand CVR is the highest-signal metric to monitor post-tracking-fix because Brand CVR is the least-dependent on market demand fluctuation. If Brand CVR returns to 7.0%+ within 7 days of tracking validation, the decline is resolvable; if it does not, structural keyword or LP investigation is required.</w:t>
+      </w:r>
+    </w:p>
+    <w:p>
+      <w:r>
+        <w:t>**Cost of inaction (null case):** If the Polaris URL migration tracking is not validated within the next 7 days, 3 consecutive weeks of CVR data will remain ambiguous — the team cannot distinguish genuine demand softness from a tracking artifact. At the current W15 run rate of 168 registrations per week, AU would deliver approximately 8,736 FY26 registrations — 32% below the 12,906 OP2 target and $600K below the $1.8M budget plan. Separately, OCI launch is targeted for May 2026 but no MCC has been created. MCC creation requires 2–3 weeks of lead time. If MCC creation does not begin this week, the May launch slips to June or later, forgoing the 18–24% registration uplift observed in comparable OCI markets (US +24%, UK +23%, DE +18%). At AU's current 168 regs/week baseline, a 20% OCI uplift would add approximately 34 registrations per week — 1,768 annualized registrations worth approximately $271K at $153 CPA.</w:t>
+      </w:r>
+    </w:p>
+    <w:p>
+      <w:r>
+        <w:t>&lt;!-- AM-OWNED:trailing-week-flags END --&gt;</w:t>
+      </w:r>
+    </w:p>
+    <w:p>
+      <w:r>
+        <w:t>&lt;!-- WBR-OWNED:signal-flags START --&gt;</w:t>
+      </w:r>
+    </w:p>
+    <w:p>
+      <w:r>
+        <w:t>&lt;!-- WBR-OWNED:signal-flags END --&gt;</w:t>
       </w:r>
     </w:p>
     <w:p>
@@ -816,7 +1200,7 @@
     </w:p>
     <w:p>
       <w:r>
-        <w:t>Three operational insights from the trailing four-week window (W11–W14) inform the immediate tactical posture:</w:t>
+        <w:t>Three operational insights from the trailing four-week window (W12–W15) inform the immediate tactical posture:</w:t>
       </w:r>
     </w:p>
     <w:p>
@@ -824,7 +1208,7 @@
         <w:pStyle w:val="ListNumber"/>
       </w:pPr>
       <w:r>
-        <w:t>**The Polaris URL migration is the most likely cause of the CVR collapse, and tracking validation is the prerequisite for every other optimization.** The W13 daily registration pattern — 53 and 50 on Monday-Tuesday, then 27, 22, 23, and 8 on Wednesday through Saturday — aligns precisely with the mid-week migration completion. Until tracking integrity is confirmed, the team cannot determine whether the 6-week decline streak reflects genuine demand softness, a tracking artifact, or a combination. Every keyword optimization, bid adjustment, and campaign restructuring decision is compromised by this uncertainty. Validation is not an optimization — it is the foundation that makes optimization possible.</w:t>
+        <w:t>**The Polaris URL migration remains the most likely cause of the CVR collapse, and April 16 Polaris LP optimization sync reinforced this hypothesis with an Italy ref tag regression as corroborating evidence.** W15 Brand CVR at 6.08% is the lowest in the trailing 8 weeks and -18% below the 8-week average of 7.46%. The April 16 meeting revealed that Italy's Polaris LP overwrote the market's ref tag, routing Italian signup traffic to the AU domain — a confirmed production failure. AU's own Polaris LP has not been subjected to the same ref tag audit. Until the audit is complete, Brand CVR degradation cannot be attributed to any specific driver. Validation is not optional — it is the precondition for every other AU optimization.</w:t>
       </w:r>
     </w:p>
     <w:p>
@@ -832,7 +1216,7 @@
         <w:pStyle w:val="ListNumber"/>
       </w:pPr>
       <w:r>
-        <w:t>**NB CPC's 7-week decline streak (-29% from W6 peak) has not yet translated to CPA improvement.** CPC at $4.81 in W13 is the lowest in the dataset, driven by bid strategy refinement and negative keyword routing. However, NB CPA remains flat at $187 because CVR degradation (-10% WoW in W13, 37% below trailing average in W14) is absorbing the CPC savings. The CPC decline creates latent CPA improvement potential: if CVR recovers to the trailing average (approximately 3.5%), NB CPA would drop to approximately $137 at current CPC levels — below the $140 OP2 target. The CVR recovery is gated on Polaris tracking validation.</w:t>
+        <w:t>**NB CPC's 8-week decline streak (from $6.53 in W8 to $4.77 in W15, -27% total) continues to hold, but NB CPA is locked at elevated levels because NB CVR remains 27% below the 8-week average.** NB CPA in W15 is $239.34, nearly identical to W14's $240.26, and still 43% above the $140 OP2 blended target. The CPC decline has delivered the efficiency Brandon requested on March 23, but CVR recovery is the gating factor for translating CPC gains into CPA improvement. If NB CVR recovers to the baseline range of 2.5%–3.5%, NB CPA mechanically drops to $170–$200 at current CPC levels.</w:t>
       </w:r>
     </w:p>
     <w:p>
@@ -840,7 +1224,7 @@
         <w:pStyle w:val="ListNumber"/>
       </w:pPr>
       <w:r>
-        <w:t>**Brandon's "outlier, not broad" keyword guidance reframes the AU optimization approach.** The March 23 sync established that keyword optimization should focus on the top 20 outliers by CPC/CPA, not broad keyword removal. CPC caps are a "two-way door" — reversible until OCI launches and provides conversion signal data. This means the biweekly keyword review with Alexis should produce a rolling top-20 outlier dashboard, not a keyword removal list. The two-campaign structure pilot (product-intent vs business-intent) was approved and should proceed as a phased test, not a wholesale restructuring.</w:t>
+        <w:t>**The W15 NB registration rebound from 74 to 91 on similar CPC suggests demand is not the structural issue.** NB clicks volume rose in W15, NB CVR recovered modestly from 1.87% to 1.99%, and NB registrations grew +23.0% WoW. This pattern indicates that the NB funnel can absorb additional traffic productively when CVR cooperates. The Brand-side weakness (CVR -10.6% WoW, registrations -19.8% WoW) is a distinct problem — one that aligns with the Polaris LP migration timing. Treating AU's decline as a unified story is incorrect; the Brand and NB dynamics are now diverging and require separate diagnostics.</w:t>
       </w:r>
     </w:p>
     <w:p>
@@ -943,7 +1327,7 @@
           </w:tcPr>
           <w:p>
             <w:r>
-              <w:t>Validate Polaris URL tracking integrity — confirm conversion tags fire correctly post-migration</w:t>
+              <w:t>Audit AU Polaris `/cp/ps-brand` page for ref tag integrity — apply the Italy-detection method from April 16 Polaris sync</w:t>
             </w:r>
           </w:p>
         </w:tc>
@@ -953,7 +1337,7 @@
           </w:tcPr>
           <w:p>
             <w:r>
-              <w:t>Richard</w:t>
+              <w:t>Richard + Alex VanDerStuyf</w:t>
             </w:r>
           </w:p>
         </w:tc>
@@ -963,7 +1347,7 @@
           </w:tcPr>
           <w:p>
             <w:r>
-              <w:t>Apr 14</w:t>
+              <w:t>Apr 22</w:t>
             </w:r>
           </w:p>
         </w:tc>
@@ -973,7 +1357,7 @@
           </w:tcPr>
           <w:p>
             <w:r>
-              <w:t>Goal 2</w:t>
+              <w:t>Goal 2, Tenet 1</w:t>
             </w:r>
           </w:p>
         </w:tc>
@@ -995,7 +1379,7 @@
           </w:tcPr>
           <w:p>
             <w:r>
-              <w:t>Respond to Lena's AU PS Weekly Update follow-up questions (landing page URLs, repeat visitor CPA)</w:t>
+              <w:t>Check AU account post-4/17 max-clicks bid strategy switch — validate W16 CPC/CVR trajectory</w:t>
             </w:r>
           </w:p>
         </w:tc>
@@ -1015,7 +1399,7 @@
           </w:tcPr>
           <w:p>
             <w:r>
-              <w:t>Apr 13</w:t>
+              <w:t>Apr 20</w:t>
             </w:r>
           </w:p>
         </w:tc>
@@ -1025,7 +1409,7 @@
           </w:tcPr>
           <w:p>
             <w:r>
-              <w:t>Tenet 3</w:t>
+              <w:t>Goal 1</w:t>
             </w:r>
           </w:p>
         </w:tc>
@@ -1047,7 +1431,7 @@
           </w:tcPr>
           <w:p>
             <w:r>
-              <w:t>Compile rolling 4-week keyword CPA dashboard (top 20 outliers by CPC/CPA) for Alexis biweekly review</w:t>
+              <w:t>Respond to Lena — AU LP URL analysis + CPA methodology (draft written Apr 3, 17 days overdue)</w:t>
             </w:r>
           </w:p>
         </w:tc>
@@ -1067,7 +1451,7 @@
           </w:tcPr>
           <w:p>
             <w:r>
-              <w:t>Apr 18</w:t>
+              <w:t>Apr 21</w:t>
             </w:r>
           </w:p>
         </w:tc>
@@ -1077,7 +1461,7 @@
           </w:tcPr>
           <w:p>
             <w:r>
-              <w:t>Goal 4</w:t>
+              <w:t>Tenet 3</w:t>
             </w:r>
           </w:p>
         </w:tc>
@@ -1099,7 +1483,7 @@
           </w:tcPr>
           <w:p>
             <w:r>
-              <w:t>Initiate OCI MCC creation for AU — required for May 2026 launch</w:t>
+              <w:t>Complete refmarker mapping audit PoC — AU (Brandon assigned, 10 days overdue)</w:t>
             </w:r>
           </w:p>
         </w:tc>
@@ -1119,7 +1503,7 @@
           </w:tcPr>
           <w:p>
             <w:r>
-              <w:t>Apr 18</w:t>
+              <w:t>Apr 22</w:t>
             </w:r>
           </w:p>
         </w:tc>
@@ -1129,7 +1513,7 @@
           </w:tcPr>
           <w:p>
             <w:r>
-              <w:t>Goal 3</w:t>
+              <w:t>Goal 2</w:t>
             </w:r>
           </w:p>
         </w:tc>
@@ -1151,7 +1535,7 @@
           </w:tcPr>
           <w:p>
             <w:r>
-              <w:t>Pilot two-campaign structure design (product-intent vs business-intent) — define success metrics and 4-week measurement plan</w:t>
+              <w:t>Initiate OCI MCC creation for AU — required for May 2026 launch</w:t>
             </w:r>
           </w:p>
         </w:tc>
@@ -1161,6 +1545,58 @@
           </w:tcPr>
           <w:p>
             <w:r>
+              <w:t>Richard + Brandon</w:t>
+            </w:r>
+          </w:p>
+        </w:tc>
+        <w:tc>
+          <w:tcPr>
+            <w:tcW w:type="dxa" w:w="1728"/>
+          </w:tcPr>
+          <w:p>
+            <w:r>
+              <w:t>Apr 22</w:t>
+            </w:r>
+          </w:p>
+        </w:tc>
+        <w:tc>
+          <w:tcPr>
+            <w:tcW w:type="dxa" w:w="1728"/>
+          </w:tcPr>
+          <w:p>
+            <w:r>
+              <w:t>Goal 3</w:t>
+            </w:r>
+          </w:p>
+        </w:tc>
+      </w:tr>
+      <w:tr>
+        <w:tc>
+          <w:tcPr>
+            <w:tcW w:type="dxa" w:w="1728"/>
+          </w:tcPr>
+          <w:p>
+            <w:r>
+              <w:t>6</w:t>
+            </w:r>
+          </w:p>
+        </w:tc>
+        <w:tc>
+          <w:tcPr>
+            <w:tcW w:type="dxa" w:w="1728"/>
+          </w:tcPr>
+          <w:p>
+            <w:r>
+              <w:t>AU meetings agenda for Tuesday 4:30pm PT sync with Lena/Alexis</w:t>
+            </w:r>
+          </w:p>
+        </w:tc>
+        <w:tc>
+          <w:tcPr>
+            <w:tcW w:type="dxa" w:w="1728"/>
+          </w:tcPr>
+          <w:p>
+            <w:r>
               <w:t>Richard</w:t>
             </w:r>
           </w:p>
@@ -1171,7 +1607,7 @@
           </w:tcPr>
           <w:p>
             <w:r>
-              <w:t>May 1</w:t>
+              <w:t>Apr 21</w:t>
             </w:r>
           </w:p>
         </w:tc>
@@ -1181,7 +1617,7 @@
           </w:tcPr>
           <w:p>
             <w:r>
-              <w:t>Goal 5</w:t>
+              <w:t>Tenet 3</w:t>
             </w:r>
           </w:p>
         </w:tc>
@@ -1217,6 +1653,14 @@
       </w:r>
     </w:p>
     <w:p>
+      <w:pPr>
+        <w:pStyle w:val="ListBullet"/>
+      </w:pPr>
+      <w:r>
+        <w:t>Polaris ref tag audit: AU page not yet validated after Italy regression discovered April 16. Blocks attribution confidence for all W14–W15 data.</w:t>
+      </w:r>
+    </w:p>
+    <w:p>
       <w:r>
         <w:t>**Stakeholder actions required:**</w:t>
       </w:r>
@@ -1226,7 +1670,7 @@
         <w:pStyle w:val="ListBullet"/>
       </w:pPr>
       <w:r>
-        <w:t>Lena: Confirm whether the two-campaign structure pilot scope meets her keyword-to-product mapping priority.</w:t>
+        <w:t>Lena: Biweekly keyword review cadence and two-campaign structure pilot scope confirmation still pending from March discussion.</w:t>
       </w:r>
     </w:p>
     <w:p>
@@ -1234,7 +1678,7 @@
         <w:pStyle w:val="ListBullet"/>
       </w:pPr>
       <w:r>
-        <w:t>Alexis: Schedule first biweekly keyword review session (target: week of Apr 14).</w:t>
+        <w:t>Alexis: Friday handover (switched to max-clicks 4/17) confirmed; AU account check today.</w:t>
       </w:r>
     </w:p>
     <w:p>
@@ -1242,7 +1686,15 @@
         <w:pStyle w:val="ListBullet"/>
       </w:pPr>
       <w:r>
-        <w:t>Brandon: Approve OCI MCC creation request for AU.</w:t>
+        <w:t>Brandon: Approve OCI MCC creation request for AU. Forward Polaris template change-requests email to Dwayne (pending from 4/17 DM request).</w:t>
+      </w:r>
+    </w:p>
+    <w:p>
+      <w:pPr>
+        <w:pStyle w:val="ListBullet"/>
+      </w:pPr>
+      <w:r>
+        <w:t>Alex VanDerStuyf (MCS): Extend Italy ref tag audit methodology to AU Polaris page.</w:t>
       </w:r>
     </w:p>
     <w:p>
@@ -1263,7 +1715,7 @@
         <w:pStyle w:val="Heading2"/>
       </w:pPr>
       <w:r>
-        <w:t>Appendix A: Weekly Trend (W7–W14)</w:t>
+        <w:t>Appendix A: Weekly Trend (W8–W15)</w:t>
       </w:r>
     </w:p>
     <w:tbl>
@@ -1382,7 +1834,7 @@
           </w:tcPr>
           <w:p>
             <w:r>
-              <w:t>W7</w:t>
+              <w:t>W8</w:t>
             </w:r>
           </w:p>
         </w:tc>
@@ -1392,7 +1844,7 @@
           </w:tcPr>
           <w:p>
             <w:r>
-              <w:t>328</w:t>
+              <w:t>256</w:t>
             </w:r>
           </w:p>
         </w:tc>
@@ -1402,7 +1854,7 @@
           </w:tcPr>
           <w:p>
             <w:r>
-              <w:t>—</w:t>
+              <w:t>94</w:t>
             </w:r>
           </w:p>
         </w:tc>
@@ -1412,7 +1864,7 @@
           </w:tcPr>
           <w:p>
             <w:r>
-              <w:t>—</w:t>
+              <w:t>162</w:t>
             </w:r>
           </w:p>
         </w:tc>
@@ -1422,7 +1874,7 @@
           </w:tcPr>
           <w:p>
             <w:r>
-              <w:t>—</w:t>
+              <w:t>$37,196</w:t>
             </w:r>
           </w:p>
         </w:tc>
@@ -1432,7 +1884,7 @@
           </w:tcPr>
           <w:p>
             <w:r>
-              <w:t>—</w:t>
+              <w:t>$145.30</w:t>
             </w:r>
           </w:p>
         </w:tc>
@@ -1442,7 +1894,7 @@
           </w:tcPr>
           <w:p>
             <w:r>
-              <w:t>—</w:t>
+              <w:t>$198.13</w:t>
             </w:r>
           </w:p>
         </w:tc>
@@ -1452,7 +1904,7 @@
           </w:tcPr>
           <w:p>
             <w:r>
-              <w:t>—</w:t>
+              <w:t>3.29%</w:t>
             </w:r>
           </w:p>
         </w:tc>
@@ -1462,7 +1914,7 @@
           </w:tcPr>
           <w:p>
             <w:r>
-              <w:t>—</w:t>
+              <w:t>$6.53</w:t>
             </w:r>
           </w:p>
         </w:tc>
@@ -1474,7 +1926,7 @@
           </w:tcPr>
           <w:p>
             <w:r>
-              <w:t>W8</w:t>
+              <w:t>W9</w:t>
             </w:r>
           </w:p>
         </w:tc>
@@ -1484,7 +1936,7 @@
           </w:tcPr>
           <w:p>
             <w:r>
-              <w:t>295</w:t>
+              <w:t>256</w:t>
             </w:r>
           </w:p>
         </w:tc>
@@ -1494,7 +1946,7 @@
           </w:tcPr>
           <w:p>
             <w:r>
-              <w:t>—</w:t>
+              <w:t>121</w:t>
             </w:r>
           </w:p>
         </w:tc>
@@ -1504,7 +1956,7 @@
           </w:tcPr>
           <w:p>
             <w:r>
-              <w:t>—</w:t>
+              <w:t>135</w:t>
             </w:r>
           </w:p>
         </w:tc>
@@ -1514,7 +1966,7 @@
           </w:tcPr>
           <w:p>
             <w:r>
-              <w:t>—</w:t>
+              <w:t>$36,408</w:t>
             </w:r>
           </w:p>
         </w:tc>
@@ -1524,7 +1976,7 @@
           </w:tcPr>
           <w:p>
             <w:r>
-              <w:t>—</w:t>
+              <w:t>$142.22</w:t>
             </w:r>
           </w:p>
         </w:tc>
@@ -1534,7 +1986,7 @@
           </w:tcPr>
           <w:p>
             <w:r>
-              <w:t>—</w:t>
+              <w:t>$223.68</w:t>
             </w:r>
           </w:p>
         </w:tc>
@@ -1544,7 +1996,7 @@
           </w:tcPr>
           <w:p>
             <w:r>
-              <w:t>—</w:t>
+              <w:t>2.84%</w:t>
             </w:r>
           </w:p>
         </w:tc>
@@ -1554,7 +2006,7 @@
           </w:tcPr>
           <w:p>
             <w:r>
-              <w:t>—</w:t>
+              <w:t>$6.36</w:t>
             </w:r>
           </w:p>
         </w:tc>
@@ -1566,7 +2018,7 @@
           </w:tcPr>
           <w:p>
             <w:r>
-              <w:t>W9</w:t>
+              <w:t>W10</w:t>
             </w:r>
           </w:p>
         </w:tc>
@@ -1576,7 +2028,7 @@
           </w:tcPr>
           <w:p>
             <w:r>
-              <w:t>280</w:t>
+              <w:t>251</w:t>
             </w:r>
           </w:p>
         </w:tc>
@@ -1586,7 +2038,7 @@
           </w:tcPr>
           <w:p>
             <w:r>
-              <w:t>—</w:t>
+              <w:t>111</w:t>
             </w:r>
           </w:p>
         </w:tc>
@@ -1596,7 +2048,7 @@
           </w:tcPr>
           <w:p>
             <w:r>
-              <w:t>—</w:t>
+              <w:t>140</w:t>
             </w:r>
           </w:p>
         </w:tc>
@@ -1606,7 +2058,7 @@
           </w:tcPr>
           <w:p>
             <w:r>
-              <w:t>—</w:t>
+              <w:t>$31,589</w:t>
             </w:r>
           </w:p>
         </w:tc>
@@ -1616,7 +2068,7 @@
           </w:tcPr>
           <w:p>
             <w:r>
-              <w:t>—</w:t>
+              <w:t>$125.85</w:t>
             </w:r>
           </w:p>
         </w:tc>
@@ -1626,7 +2078,7 @@
           </w:tcPr>
           <w:p>
             <w:r>
-              <w:t>—</w:t>
+              <w:t>$189.14</w:t>
             </w:r>
           </w:p>
         </w:tc>
@@ -1636,7 +2088,7 @@
           </w:tcPr>
           <w:p>
             <w:r>
-              <w:t>—</w:t>
+              <w:t>3.08%</w:t>
             </w:r>
           </w:p>
         </w:tc>
@@ -1646,7 +2098,7 @@
           </w:tcPr>
           <w:p>
             <w:r>
-              <w:t>—</w:t>
+              <w:t>$5.83</w:t>
             </w:r>
           </w:p>
         </w:tc>
@@ -1658,7 +2110,7 @@
           </w:tcPr>
           <w:p>
             <w:r>
-              <w:t>W10</w:t>
+              <w:t>W11</w:t>
             </w:r>
           </w:p>
         </w:tc>
@@ -1668,7 +2120,7 @@
           </w:tcPr>
           <w:p>
             <w:r>
-              <w:t>260</w:t>
+              <w:t>241</w:t>
             </w:r>
           </w:p>
         </w:tc>
@@ -1678,7 +2130,7 @@
           </w:tcPr>
           <w:p>
             <w:r>
-              <w:t>—</w:t>
+              <w:t>108</w:t>
             </w:r>
           </w:p>
         </w:tc>
@@ -1688,7 +2140,7 @@
           </w:tcPr>
           <w:p>
             <w:r>
-              <w:t>—</w:t>
+              <w:t>133</w:t>
             </w:r>
           </w:p>
         </w:tc>
@@ -1698,7 +2150,7 @@
           </w:tcPr>
           <w:p>
             <w:r>
-              <w:t>—</w:t>
+              <w:t>$30,999</w:t>
             </w:r>
           </w:p>
         </w:tc>
@@ -1708,7 +2160,7 @@
           </w:tcPr>
           <w:p>
             <w:r>
-              <w:t>—</w:t>
+              <w:t>$128.63</w:t>
             </w:r>
           </w:p>
         </w:tc>
@@ -1718,7 +2170,7 @@
           </w:tcPr>
           <w:p>
             <w:r>
-              <w:t>—</w:t>
+              <w:t>$198.41</w:t>
             </w:r>
           </w:p>
         </w:tc>
@@ -1728,7 +2180,7 @@
           </w:tcPr>
           <w:p>
             <w:r>
-              <w:t>—</w:t>
+              <w:t>2.79%</w:t>
             </w:r>
           </w:p>
         </w:tc>
@@ -1738,7 +2190,7 @@
           </w:tcPr>
           <w:p>
             <w:r>
-              <w:t>—</w:t>
+              <w:t>$5.53</w:t>
             </w:r>
           </w:p>
         </w:tc>
@@ -1750,7 +2202,7 @@
           </w:tcPr>
           <w:p>
             <w:r>
-              <w:t>W11</w:t>
+              <w:t>W12</w:t>
             </w:r>
           </w:p>
         </w:tc>
@@ -1760,7 +2212,7 @@
           </w:tcPr>
           <w:p>
             <w:r>
-              <w:t>245</w:t>
+              <w:t>244</w:t>
             </w:r>
           </w:p>
         </w:tc>
@@ -1770,7 +2222,7 @@
           </w:tcPr>
           <w:p>
             <w:r>
-              <w:t>—</w:t>
+              <w:t>119</w:t>
             </w:r>
           </w:p>
         </w:tc>
@@ -1780,7 +2232,7 @@
           </w:tcPr>
           <w:p>
             <w:r>
-              <w:t>—</w:t>
+              <w:t>125</w:t>
             </w:r>
           </w:p>
         </w:tc>
@@ -1790,7 +2242,7 @@
           </w:tcPr>
           <w:p>
             <w:r>
-              <w:t>$27K</w:t>
+              <w:t>$28,005</w:t>
             </w:r>
           </w:p>
         </w:tc>
@@ -1800,7 +2252,7 @@
           </w:tcPr>
           <w:p>
             <w:r>
-              <w:t>$110</w:t>
+              <w:t>$114.77</w:t>
             </w:r>
           </w:p>
         </w:tc>
@@ -1810,7 +2262,7 @@
           </w:tcPr>
           <w:p>
             <w:r>
-              <w:t>—</w:t>
+              <w:t>$188.51</w:t>
             </w:r>
           </w:p>
         </w:tc>
@@ -1820,7 +2272,7 @@
           </w:tcPr>
           <w:p>
             <w:r>
-              <w:t>—</w:t>
+              <w:t>2.85%</w:t>
             </w:r>
           </w:p>
         </w:tc>
@@ -1830,7 +2282,7 @@
           </w:tcPr>
           <w:p>
             <w:r>
-              <w:t>$5.20</w:t>
+              <w:t>$5.37</w:t>
             </w:r>
           </w:p>
         </w:tc>
@@ -1842,7 +2294,7 @@
           </w:tcPr>
           <w:p>
             <w:r>
-              <w:t>W12</w:t>
+              <w:t>W13</w:t>
             </w:r>
           </w:p>
         </w:tc>
@@ -1852,7 +2304,7 @@
           </w:tcPr>
           <w:p>
             <w:r>
-              <w:t>230</w:t>
+              <w:t>208</w:t>
             </w:r>
           </w:p>
         </w:tc>
@@ -1862,7 +2314,7 @@
           </w:tcPr>
           <w:p>
             <w:r>
-              <w:t>—</w:t>
+              <w:t>98</w:t>
             </w:r>
           </w:p>
         </w:tc>
@@ -1872,7 +2324,7 @@
           </w:tcPr>
           <w:p>
             <w:r>
-              <w:t>—</w:t>
+              <w:t>110</w:t>
             </w:r>
           </w:p>
         </w:tc>
@@ -1882,7 +2334,7 @@
           </w:tcPr>
           <w:p>
             <w:r>
-              <w:t>$26K</w:t>
+              <w:t>$24,381</w:t>
             </w:r>
           </w:p>
         </w:tc>
@@ -1892,7 +2344,7 @@
           </w:tcPr>
           <w:p>
             <w:r>
-              <w:t>$113</w:t>
+              <w:t>$117.22</w:t>
             </w:r>
           </w:p>
         </w:tc>
@@ -1902,7 +2354,7 @@
           </w:tcPr>
           <w:p>
             <w:r>
-              <w:t>—</w:t>
+              <w:t>$184.99</w:t>
             </w:r>
           </w:p>
         </w:tc>
@@ -1912,7 +2364,7 @@
           </w:tcPr>
           <w:p>
             <w:r>
-              <w:t>—</w:t>
+              <w:t>2.60%</w:t>
             </w:r>
           </w:p>
         </w:tc>
@@ -1922,7 +2374,7 @@
           </w:tcPr>
           <w:p>
             <w:r>
-              <w:t>$5.00</w:t>
+              <w:t>$4.81</w:t>
             </w:r>
           </w:p>
         </w:tc>
@@ -1934,7 +2386,7 @@
           </w:tcPr>
           <w:p>
             <w:r>
-              <w:t>W13</w:t>
+              <w:t>W14</w:t>
             </w:r>
           </w:p>
         </w:tc>
@@ -1944,7 +2396,7 @@
           </w:tcPr>
           <w:p>
             <w:r>
-              <w:t>207</w:t>
+              <w:t>170</w:t>
             </w:r>
           </w:p>
         </w:tc>
@@ -1954,7 +2406,7 @@
           </w:tcPr>
           <w:p>
             <w:r>
-              <w:t>98</w:t>
+              <w:t>96</w:t>
             </w:r>
           </w:p>
         </w:tc>
@@ -1964,7 +2416,7 @@
           </w:tcPr>
           <w:p>
             <w:r>
-              <w:t>109</w:t>
+              <w:t>74</w:t>
             </w:r>
           </w:p>
         </w:tc>
@@ -1974,7 +2426,7 @@
           </w:tcPr>
           <w:p>
             <w:r>
-              <w:t>$24K</w:t>
+              <w:t>$22,074</w:t>
             </w:r>
           </w:p>
         </w:tc>
@@ -1984,7 +2436,7 @@
           </w:tcPr>
           <w:p>
             <w:r>
-              <w:t>$118</w:t>
+              <w:t>$129.84</w:t>
             </w:r>
           </w:p>
         </w:tc>
@@ -1994,7 +2446,7 @@
           </w:tcPr>
           <w:p>
             <w:r>
-              <w:t>$187</w:t>
+              <w:t>$240.26</w:t>
             </w:r>
           </w:p>
         </w:tc>
@@ -2004,7 +2456,7 @@
           </w:tcPr>
           <w:p>
             <w:r>
-              <w:t>2.58%</w:t>
+              <w:t>1.87%</w:t>
             </w:r>
           </w:p>
         </w:tc>
@@ -2014,7 +2466,7 @@
           </w:tcPr>
           <w:p>
             <w:r>
-              <w:t>$4.81</w:t>
+              <w:t>$4.50</w:t>
             </w:r>
           </w:p>
         </w:tc>
@@ -2026,7 +2478,7 @@
           </w:tcPr>
           <w:p>
             <w:r>
-              <w:t>W14</w:t>
+              <w:t>W15</w:t>
             </w:r>
           </w:p>
         </w:tc>
@@ -2036,7 +2488,7 @@
           </w:tcPr>
           <w:p>
             <w:r>
-              <w:t>170</w:t>
+              <w:t>168</w:t>
             </w:r>
           </w:p>
         </w:tc>
@@ -2046,7 +2498,7 @@
           </w:tcPr>
           <w:p>
             <w:r>
-              <w:t>~73</w:t>
+              <w:t>77</w:t>
             </w:r>
           </w:p>
         </w:tc>
@@ -2056,7 +2508,7 @@
           </w:tcPr>
           <w:p>
             <w:r>
-              <w:t>~97</w:t>
+              <w:t>91</w:t>
             </w:r>
           </w:p>
         </w:tc>
@@ -2066,7 +2518,7 @@
           </w:tcPr>
           <w:p>
             <w:r>
-              <w:t>$22K</w:t>
+              <w:t>$25,829</w:t>
             </w:r>
           </w:p>
         </w:tc>
@@ -2076,7 +2528,7 @@
           </w:tcPr>
           <w:p>
             <w:r>
-              <w:t>$130</w:t>
+              <w:t>$153.74</w:t>
             </w:r>
           </w:p>
         </w:tc>
@@ -2086,7 +2538,7 @@
           </w:tcPr>
           <w:p>
             <w:r>
-              <w:t>—</w:t>
+              <w:t>$239.34</w:t>
             </w:r>
           </w:p>
         </w:tc>
@@ -2096,7 +2548,7 @@
           </w:tcPr>
           <w:p>
             <w:r>
-              <w:t>—</w:t>
+              <w:t>1.99%</w:t>
             </w:r>
           </w:p>
         </w:tc>
@@ -2106,7 +2558,7 @@
           </w:tcPr>
           <w:p>
             <w:r>
-              <w:t>—</w:t>
+              <w:t>$4.77</w:t>
             </w:r>
           </w:p>
         </w:tc>
@@ -2114,7 +2566,7 @@
     </w:tbl>
     <w:p>
       <w:r>
-        <w:t>**6-week decline streak:** W7 (328) → W8 (295) → W9 (280) → W10 (260) → W11 (245) → W12 (230) → W13 (207) → W14 (170). Cumulative decline: -48% from W7 peak.</w:t>
+        <w:t>**7-week decline streak:** W8 (256) → W9 (256) → W10 (251) → W11 (241) → W12 (244) → W13 (208) → W14 (170) → W15 (168). Cumulative decline: -34% from W8. NB CPC 8-week decline: $6.53 → $4.77, -27% cumulative.</w:t>
       </w:r>
     </w:p>
     <w:p>
@@ -2135,7 +2587,7 @@
         <w:pStyle w:val="Heading2"/>
       </w:pPr>
       <w:r>
-        <w:t>Appendix C: March 2026 Monthly Projection</w:t>
+        <w:t>Appendix C: April 2026 Monthly Projection</w:t>
       </w:r>
     </w:p>
     <w:tbl>
@@ -2145,15 +2597,16 @@
         <w:tblLook w:firstColumn="1" w:firstRow="1" w:lastColumn="0" w:lastRow="0" w:noHBand="0" w:noVBand="1" w:val="04A0"/>
       </w:tblPr>
       <w:tblGrid>
-        <w:gridCol w:w="2160"/>
-        <w:gridCol w:w="2160"/>
-        <w:gridCol w:w="2160"/>
-        <w:gridCol w:w="2160"/>
+        <w:gridCol w:w="1728"/>
+        <w:gridCol w:w="1728"/>
+        <w:gridCol w:w="1728"/>
+        <w:gridCol w:w="1728"/>
+        <w:gridCol w:w="1728"/>
       </w:tblGrid>
       <w:tr>
         <w:tc>
           <w:tcPr>
-            <w:tcW w:type="dxa" w:w="2160"/>
+            <w:tcW w:type="dxa" w:w="1728"/>
           </w:tcPr>
           <w:p>
             <w:r>
@@ -2163,31 +2616,41 @@
         </w:tc>
         <w:tc>
           <w:tcPr>
-            <w:tcW w:type="dxa" w:w="2160"/>
-          </w:tcPr>
-          <w:p>
-            <w:r>
-              <w:t>Projected EOM</w:t>
-            </w:r>
-          </w:p>
-        </w:tc>
-        <w:tc>
-          <w:tcPr>
-            <w:tcW w:type="dxa" w:w="2160"/>
-          </w:tcPr>
-          <w:p>
-            <w:r>
-              <w:t>OP2 Target</w:t>
-            </w:r>
-          </w:p>
-        </w:tc>
-        <w:tc>
-          <w:tcPr>
-            <w:tcW w:type="dxa" w:w="2160"/>
-          </w:tcPr>
-          <w:p>
-            <w:r>
-              <w:t>vs OP2</w:t>
+            <w:tcW w:type="dxa" w:w="1728"/>
+          </w:tcPr>
+          <w:p>
+            <w:r>
+              <w:t>MTD (Apr 1–12)</w:t>
+            </w:r>
+          </w:p>
+        </w:tc>
+        <w:tc>
+          <w:tcPr>
+            <w:tcW w:type="dxa" w:w="1728"/>
+          </w:tcPr>
+          <w:p>
+            <w:r>
+              <w:t>OP2 Month Target</w:t>
+            </w:r>
+          </w:p>
+        </w:tc>
+        <w:tc>
+          <w:tcPr>
+            <w:tcW w:type="dxa" w:w="1728"/>
+          </w:tcPr>
+          <w:p>
+            <w:r>
+              <w:t>MTD Pacing</w:t>
+            </w:r>
+          </w:p>
+        </w:tc>
+        <w:tc>
+          <w:tcPr>
+            <w:tcW w:type="dxa" w:w="1728"/>
+          </w:tcPr>
+          <w:p>
+            <w:r>
+              <w:t>W16 Forecast</w:t>
             </w:r>
           </w:p>
         </w:tc>
@@ -2195,7 +2658,7 @@
       <w:tr>
         <w:tc>
           <w:tcPr>
-            <w:tcW w:type="dxa" w:w="2160"/>
+            <w:tcW w:type="dxa" w:w="1728"/>
           </w:tcPr>
           <w:p>
             <w:r>
@@ -2205,31 +2668,41 @@
         </w:tc>
         <w:tc>
           <w:tcPr>
-            <w:tcW w:type="dxa" w:w="2160"/>
-          </w:tcPr>
-          <w:p>
-            <w:r>
-              <w:t>~1,030</w:t>
-            </w:r>
-          </w:p>
-        </w:tc>
-        <w:tc>
-          <w:tcPr>
-            <w:tcW w:type="dxa" w:w="2160"/>
-          </w:tcPr>
-          <w:p>
-            <w:r>
-              <w:t>1,082</w:t>
-            </w:r>
-          </w:p>
-        </w:tc>
-        <w:tc>
-          <w:tcPr>
-            <w:tcW w:type="dxa" w:w="2160"/>
-          </w:tcPr>
-          <w:p>
-            <w:r>
-              <w:t>-5%</w:t>
+            <w:tcW w:type="dxa" w:w="1728"/>
+          </w:tcPr>
+          <w:p>
+            <w:r>
+              <w:t>168</w:t>
+            </w:r>
+          </w:p>
+        </w:tc>
+        <w:tc>
+          <w:tcPr>
+            <w:tcW w:type="dxa" w:w="1728"/>
+          </w:tcPr>
+          <w:p>
+            <w:r>
+              <w:t>1,071</w:t>
+            </w:r>
+          </w:p>
+        </w:tc>
+        <w:tc>
+          <w:tcPr>
+            <w:tcW w:type="dxa" w:w="1728"/>
+          </w:tcPr>
+          <w:p>
+            <w:r>
+              <w:t>15.7% at 19% elapsed</w:t>
+            </w:r>
+          </w:p>
+        </w:tc>
+        <w:tc>
+          <w:tcPr>
+            <w:tcW w:type="dxa" w:w="1728"/>
+          </w:tcPr>
+          <w:p>
+            <w:r>
+              <w:t>207 (CI 188–288)</w:t>
             </w:r>
           </w:p>
         </w:tc>
@@ -2237,7 +2710,7 @@
       <w:tr>
         <w:tc>
           <w:tcPr>
-            <w:tcW w:type="dxa" w:w="2160"/>
+            <w:tcW w:type="dxa" w:w="1728"/>
           </w:tcPr>
           <w:p>
             <w:r>
@@ -2247,31 +2720,41 @@
         </w:tc>
         <w:tc>
           <w:tcPr>
-            <w:tcW w:type="dxa" w:w="2160"/>
-          </w:tcPr>
-          <w:p>
-            <w:r>
-              <w:t>~$125K</w:t>
-            </w:r>
-          </w:p>
-        </w:tc>
-        <w:tc>
-          <w:tcPr>
-            <w:tcW w:type="dxa" w:w="2160"/>
-          </w:tcPr>
-          <w:p>
-            <w:r>
-              <w:t>$148K</w:t>
-            </w:r>
-          </w:p>
-        </w:tc>
-        <w:tc>
-          <w:tcPr>
-            <w:tcW w:type="dxa" w:w="2160"/>
-          </w:tcPr>
-          <w:p>
-            <w:r>
-              <w:t>-15%</w:t>
+            <w:tcW w:type="dxa" w:w="1728"/>
+          </w:tcPr>
+          <w:p>
+            <w:r>
+              <w:t>$25,829</w:t>
+            </w:r>
+          </w:p>
+        </w:tc>
+        <w:tc>
+          <w:tcPr>
+            <w:tcW w:type="dxa" w:w="1728"/>
+          </w:tcPr>
+          <w:p>
+            <w:r>
+              <w:t>$147,592</w:t>
+            </w:r>
+          </w:p>
+        </w:tc>
+        <w:tc>
+          <w:tcPr>
+            <w:tcW w:type="dxa" w:w="1728"/>
+          </w:tcPr>
+          <w:p>
+            <w:r>
+              <w:t>17.5% at 19% elapsed</w:t>
+            </w:r>
+          </w:p>
+        </w:tc>
+        <w:tc>
+          <w:tcPr>
+            <w:tcW w:type="dxa" w:w="1728"/>
+          </w:tcPr>
+          <w:p>
+            <w:r>
+              <w:t>$26,396</w:t>
             </w:r>
           </w:p>
         </w:tc>
@@ -2279,7 +2762,7 @@
       <w:tr>
         <w:tc>
           <w:tcPr>
-            <w:tcW w:type="dxa" w:w="2160"/>
+            <w:tcW w:type="dxa" w:w="1728"/>
           </w:tcPr>
           <w:p>
             <w:r>
@@ -2289,36 +2772,51 @@
         </w:tc>
         <w:tc>
           <w:tcPr>
-            <w:tcW w:type="dxa" w:w="2160"/>
-          </w:tcPr>
-          <w:p>
-            <w:r>
-              <w:t>~$121</w:t>
-            </w:r>
-          </w:p>
-        </w:tc>
-        <w:tc>
-          <w:tcPr>
-            <w:tcW w:type="dxa" w:w="2160"/>
-          </w:tcPr>
-          <w:p>
-            <w:r>
-              <w:t>$136</w:t>
-            </w:r>
-          </w:p>
-        </w:tc>
-        <w:tc>
-          <w:tcPr>
-            <w:tcW w:type="dxa" w:w="2160"/>
-          </w:tcPr>
-          <w:p>
-            <w:r>
-              <w:t>-11% (better)</w:t>
+            <w:tcW w:type="dxa" w:w="1728"/>
+          </w:tcPr>
+          <w:p>
+            <w:r>
+              <w:t>$153.74</w:t>
+            </w:r>
+          </w:p>
+        </w:tc>
+        <w:tc>
+          <w:tcPr>
+            <w:tcW w:type="dxa" w:w="1728"/>
+          </w:tcPr>
+          <w:p>
+            <w:r>
+              <w:t>$138</w:t>
+            </w:r>
+          </w:p>
+        </w:tc>
+        <w:tc>
+          <w:tcPr>
+            <w:tcW w:type="dxa" w:w="1728"/>
+          </w:tcPr>
+          <w:p>
+            <w:r>
+              <w:t>+11% above target</w:t>
+            </w:r>
+          </w:p>
+        </w:tc>
+        <w:tc>
+          <w:tcPr>
+            <w:tcW w:type="dxa" w:w="1728"/>
+          </w:tcPr>
+          <w:p>
+            <w:r>
+              <w:t>$115 (forecast)</w:t>
             </w:r>
           </w:p>
         </w:tc>
       </w:tr>
     </w:tbl>
+    <w:p>
+      <w:r>
+        <w:t>MTD data reflects only W15 (Apr 6–12). Pacing will be reassessed at W16. The W16 forecast assumes a post-Easter recovery pattern consistent with April 2025.</w:t>
+      </w:r>
+    </w:p>
     <w:p>
       <w:pPr>
         <w:pStyle w:val="Heading2"/>
@@ -2376,7 +2874,7 @@
           </w:tcPr>
           <w:p>
             <w:r>
-              <w:t>Run Rate (W14)</w:t>
+              <w:t>Run Rate (W15)</w:t>
             </w:r>
           </w:p>
         </w:tc>
@@ -2418,7 +2916,7 @@
           </w:tcPr>
           <w:p>
             <w:r>
-              <w:t>$1.14M annualized</w:t>
+              <w:t>$1.34M annualized</w:t>
             </w:r>
           </w:p>
         </w:tc>
@@ -2460,7 +2958,7 @@
           </w:tcPr>
           <w:p>
             <w:r>
-              <w:t>8,840 annualized</w:t>
+              <w:t>8,736 annualized</w:t>
             </w:r>
           </w:p>
         </w:tc>
@@ -2502,7 +3000,7 @@
           </w:tcPr>
           <w:p>
             <w:r>
-              <w:t>$130</w:t>
+              <w:t>$154</w:t>
             </w:r>
           </w:p>
         </w:tc>
@@ -2510,7 +3008,7 @@
     </w:tbl>
     <w:p>
       <w:r>
-        <w:t>At the W14 run rate, AU would deliver approximately 8,840 registrations on $1.14M spend at $130 CPA — 31% below the OP2 registration target but 7% below the CPA target (favorable). The gap is a volume problem, not an efficiency problem. OCI (projected +18–24% uplift) and Polaris tracking validation are the two highest-leverage interventions to close the volume gap.</w:t>
+        <w:t>At the W15 run rate, AU would deliver approximately 8,736 registrations on $1.34M spend at $154 CPA — 32% below the OP2 registration target and $13 above the CPA target. The volume gap has widened versus the W14 snapshot (from -31% to -32%). OCI (projected +18–24% uplift) and Polaris tracking validation remain the two highest-leverage interventions to close the volume gap.</w:t>
       </w:r>
     </w:p>
     <w:p>
@@ -2880,6 +3378,70 @@
           <w:p>
             <w:r>
               <w:t>Richard</w:t>
+            </w:r>
+          </w:p>
+        </w:tc>
+      </w:tr>
+      <w:tr>
+        <w:tc>
+          <w:tcPr>
+            <w:tcW w:type="dxa" w:w="2880"/>
+          </w:tcPr>
+          <w:p>
+            <w:r>
+              <w:t>4/16</w:t>
+            </w:r>
+          </w:p>
+        </w:tc>
+        <w:tc>
+          <w:tcPr>
+            <w:tcW w:type="dxa" w:w="2880"/>
+          </w:tcPr>
+          <w:p>
+            <w:r>
+              <w:t>Italy Polaris ref tag regression detected (routed IT traffic to AU domain); AU page integrity check opened</w:t>
+            </w:r>
+          </w:p>
+        </w:tc>
+        <w:tc>
+          <w:tcPr>
+            <w:tcW w:type="dxa" w:w="2880"/>
+          </w:tcPr>
+          <w:p>
+            <w:r>
+              <w:t>MCS + Richard</w:t>
+            </w:r>
+          </w:p>
+        </w:tc>
+      </w:tr>
+      <w:tr>
+        <w:tc>
+          <w:tcPr>
+            <w:tcW w:type="dxa" w:w="2880"/>
+          </w:tcPr>
+          <w:p>
+            <w:r>
+              <w:t>4/17</w:t>
+            </w:r>
+          </w:p>
+        </w:tc>
+        <w:tc>
+          <w:tcPr>
+            <w:tcW w:type="dxa" w:w="2880"/>
+          </w:tcPr>
+          <w:p>
+            <w:r>
+              <w:t>Switched AU to max-clicks bid strategy; handover from Alexis</w:t>
+            </w:r>
+          </w:p>
+        </w:tc>
+        <w:tc>
+          <w:tcPr>
+            <w:tcW w:type="dxa" w:w="2880"/>
+          </w:tcPr>
+          <w:p>
+            <w:r>
+              <w:t>Richard + Alexis</w:t>
             </w:r>
           </w:p>
         </w:tc>

</xml_diff>